<commit_message>
Fix questions-only doc to match what's actually in the deck
Previous version pulled all 18 questions from case-27.md's full master
list; the deck only shows 19 items across 4 sections (3 wave cards'
goal/criteria/clarifications + 4 wishes questions). Rebuilt to mirror
the pptx exactly.

Co-Authored-By: Claude Sonnet 5 <noreply@anthropic.com>
Claude-Session: https://claude.ai/code/session_01DpSN8JwCJ3tg3JVUadr2zE
</commit_message>
<xml_diff>
--- a/docs/presentations/case-27-voprosy-k-zakazchiku.docx
+++ b/docs/presentations/case-27-voprosy-k-zakazchiku.docx
@@ -15,164 +15,217 @@
     </w:p>
     <w:p>
       <w:pPr>
-        <w:pStyle w:val="ListNumber"/>
-        <w:spacing w:after="200"/>
+        <w:pStyle w:val="Heading2"/>
       </w:pPr>
       <w:r>
-        <w:t>Волна 1 «RAG-документы» — что именно имеется в виду: (а) новые типы документов сверх пилотных двух коллекций, (б) улучшение качества/покрытия уже загруженного, или (в) отдельная новая коллекция под конкретную задачу/подразделение? Для оценки объёма: сколько коллекций в результате (расширяются существующие 2 или добавляются новые — и сколько), и примерный объём корпуса (количество документов, средний размер, темп прироста).</w:t>
+        <w:rPr>
+          <w:sz w:val="26"/>
+        </w:rPr>
+        <w:t>Волна 1 — RAG-документы</w:t>
       </w:r>
     </w:p>
     <w:p>
       <w:pPr>
         <w:pStyle w:val="ListNumber"/>
-        <w:spacing w:after="200"/>
+        <w:spacing w:after="160"/>
       </w:pPr>
       <w:r>
-        <w:t>Цель и критерий волны 1 — какой результат для бизнеса должна дать волна 1: что именно изменится для пользователей или процессов? По каким признакам вы будете считать волну 1 завершённой и успешной?</w:t>
+        <w:t>Какой результат для бизнеса должна дать волна 1? Что изменится для пользователей/процессов?</w:t>
       </w:r>
     </w:p>
     <w:p>
       <w:pPr>
         <w:pStyle w:val="ListNumber"/>
-        <w:spacing w:after="200"/>
+        <w:spacing w:after="160"/>
       </w:pPr>
       <w:r>
-        <w:t>Волна 3 и далее — есть ли уже примерное направление (роли, новые источники, промышленная эксплуатация), или это открытый вопрос до завершения волны 2?</w:t>
+        <w:t>Толкование: новые типы документов / улучшение существующих / новая коллекция?</w:t>
       </w:r>
     </w:p>
     <w:p>
       <w:pPr>
         <w:pStyle w:val="ListNumber"/>
-        <w:spacing w:after="200"/>
+        <w:spacing w:after="160"/>
       </w:pPr>
       <w:r>
-        <w:t>Цель и критерий волны 3+ — когда направление определится, какая бизнес-цель будет стоять за этой волной, и какими критериями вы будете руководствоваться при выборе (что считать успехом)?</w:t>
+        <w:t>Состав и объём: темы, количество коллекций и документов</w:t>
       </w:r>
     </w:p>
     <w:p>
       <w:pPr>
         <w:pStyle w:val="ListNumber"/>
-        <w:spacing w:after="200"/>
+        <w:spacing w:after="160"/>
       </w:pPr>
       <w:r>
-        <w:t>Какие конкретно витрины данных нужно добавить в ESB сверх текущего среза CRM (Bitrix24)? Нужен список с владельцами на стороне Д8 — и явное число: сколько витрин добавляется сверх пилотных 4.</w:t>
+        <w:t>Пользователи и роли волны 1</w:t>
       </w:r>
     </w:p>
     <w:p>
       <w:pPr>
         <w:pStyle w:val="ListNumber"/>
-        <w:spacing w:after="200"/>
+        <w:spacing w:after="160"/>
       </w:pPr>
       <w:r>
-        <w:t>Какие конкретно API нужно открыть через шину — по каждому: система-источник, формат (REST/SOAP/др.), кто на стороне Д8 отвечает за контракт API.</w:t>
+        <w:t>По каким признакам вы будете считать волну 1 завершённой и успешной?</w:t>
+      </w:r>
+    </w:p>
+    <w:p>
+      <w:pPr>
+        <w:pStyle w:val="Heading2"/>
+      </w:pPr>
+      <w:r>
+        <w:rPr>
+          <w:sz w:val="26"/>
+        </w:rPr>
+        <w:t>Волна 2 — КХД / ESB</w:t>
       </w:r>
     </w:p>
     <w:p>
       <w:pPr>
         <w:pStyle w:val="ListNumber"/>
-        <w:spacing w:after="200"/>
+        <w:spacing w:after="160"/>
       </w:pPr>
       <w:r>
-        <w:t>КХД — расширяется ли состав таблиц/витрин внутри самого хранилища, или его периметр остаётся как в пилоте?</w:t>
+        <w:t>Какую бизнес-задачу решает расширение ESB/КХД? Что станет возможным, чего нет сейчас?</w:t>
       </w:r>
     </w:p>
     <w:p>
       <w:pPr>
         <w:pStyle w:val="ListNumber"/>
-        <w:spacing w:after="200"/>
+        <w:spacing w:after="160"/>
       </w:pPr>
       <w:r>
-        <w:t>Цель и критерий волны 2 — какую бизнес-задачу решает расширение ESB/КХД: что станет возможным, чего нет сейчас? По какому набору проверок/сценариев вы примете волну 2 как завершённую?</w:t>
+        <w:t>Витрины: список, владельцы на стороне Д8, точное число сверх 4</w:t>
       </w:r>
     </w:p>
     <w:p>
       <w:pPr>
         <w:pStyle w:val="ListNumber"/>
-        <w:spacing w:after="200"/>
+        <w:spacing w:after="160"/>
       </w:pPr>
       <w:r>
-        <w:t>Реальная оргструктура для проекта: список подразделений/ролей с числом пользователей в каждой — нужна для карты волн 3+. Отдельно по волнам 1 и 2: сколько пользователей и какие именно роли получают доступ в рамках именно этой волны — тот же контур, что в пилоте (до 20 пользователей, 2 роли), или шире.</w:t>
+        <w:t>API шины: система-источник, формат, ответственный</w:t>
       </w:r>
     </w:p>
     <w:p>
       <w:pPr>
         <w:pStyle w:val="ListNumber"/>
-        <w:spacing w:after="200"/>
+        <w:spacing w:after="160"/>
       </w:pPr>
       <w:r>
-        <w:t>Разграничение прав «compliance видит своё, менеджер — своих клиентов» — обязательное требование для проекта или можно оставить на будущее?</w:t>
+        <w:t>КХД: периметр хранилища; пользователи и роли волны</w:t>
       </w:r>
     </w:p>
     <w:p>
       <w:pPr>
         <w:pStyle w:val="ListNumber"/>
-        <w:spacing w:after="200"/>
+        <w:spacing w:after="160"/>
       </w:pPr>
       <w:r>
-        <w:t>Права доступа сотрудников сейчас фиксированы по статичному списку политик. Для проекта это должно стать динамическим через API — но нужна точная схема процесса: права хранятся и администрируются внутри самой платформы, или платформа только получает их из внешней системы-источника через API и применяет как есть? Если второе — какая система источник истины и как часто права обновляются?</w:t>
+        <w:t>По какому набору проверок/сценариев вы примете волну 2 как завершённую?</w:t>
+      </w:r>
+    </w:p>
+    <w:p>
+      <w:pPr>
+        <w:pStyle w:val="Heading2"/>
+      </w:pPr>
+      <w:r>
+        <w:rPr>
+          <w:sz w:val="26"/>
+        </w:rPr>
+        <w:t>Волна 3+ — направление не определено</w:t>
       </w:r>
     </w:p>
     <w:p>
       <w:pPr>
         <w:pStyle w:val="ListNumber"/>
-        <w:spacing w:after="200"/>
+        <w:spacing w:after="160"/>
       </w:pPr>
       <w:r>
-        <w:t>Email, Word/PDF-регламенты, Confluence — они не входили в пилот. Подтверждается ли, что они НЕ входят и в проект, или это отдельный вопрос, который ещё предстоит решить?</w:t>
+        <w:t>Когда направление определится — какая бизнес-цель будет стоять за волной 3+?</w:t>
       </w:r>
     </w:p>
     <w:p>
       <w:pPr>
         <w:pStyle w:val="ListNumber"/>
-        <w:spacing w:after="200"/>
+        <w:spacing w:after="160"/>
       </w:pPr>
       <w:r>
-        <w:t>Email помечен Must Have в мастер-ТЗ, но тест-кейсы отсутствовали уже в пилоте — снимается ли это требование в проекте или переносится?</w:t>
+        <w:t>Кандидаты: роли, динамические права, новые источники</w:t>
       </w:r>
     </w:p>
     <w:p>
       <w:pPr>
         <w:pStyle w:val="ListNumber"/>
-        <w:spacing w:after="200"/>
+        <w:spacing w:after="160"/>
       </w:pPr>
       <w:r>
-        <w:t>Кастомизация выбора источников — нужно уточнить, что именно имеется в виду: (а) подключение/отключение целых каталогов данных внутри домена компании, или (б) выбор персоны/профиля пользователя с отдельным набором прав доступа к источникам?</w:t>
+        <w:t>Реальная оргструктура — факт, не гипотеза из мастер-ТЗ</w:t>
       </w:r>
     </w:p>
     <w:p>
       <w:pPr>
         <w:pStyle w:val="ListNumber"/>
-        <w:spacing w:after="200"/>
+        <w:spacing w:after="160"/>
       </w:pPr>
       <w:r>
-        <w:t>Персональные RAG-коллекции пользователей — нужно уточнить механику: имеется в виду фильтр по документам внутри уже существующей коллекции, или отдельная новая коллекция, которую пользователь создаёт и наполняет сам?</w:t>
+        <w:t>Когда определится — тот же набор параметров, что у волн 1–2</w:t>
       </w:r>
     </w:p>
     <w:p>
       <w:pPr>
         <w:pStyle w:val="ListNumber"/>
-        <w:spacing w:after="200"/>
+        <w:spacing w:after="160"/>
       </w:pPr>
       <w:r>
-        <w:t>Упрощение заведения пользователей — нужен не общий запрос, а конкретный кейс: как должен выглядеть процесс пошагово (кто инициирует, какие поля заполняются, кто подтверждает)?</w:t>
+        <w:t>Какими критериями вы будете руководствоваться при выборе направления?</w:t>
+      </w:r>
+    </w:p>
+    <w:p>
+      <w:pPr>
+        <w:pStyle w:val="Heading2"/>
+      </w:pPr>
+      <w:r>
+        <w:rPr>
+          <w:sz w:val="26"/>
+        </w:rPr>
+        <w:t>Вопросы по пожеланиям заказчика</w:t>
       </w:r>
     </w:p>
     <w:p>
       <w:pPr>
         <w:pStyle w:val="ListNumber"/>
-        <w:spacing w:after="200"/>
+        <w:spacing w:after="160"/>
       </w:pPr>
       <w:r>
-        <w:t>Кто со стороны Д8 — новый владелец процесса на фазе П4 (промышленная эксплуатация)? Тот же технический контакт, что в пилоте, или отдельная выделенная роль/команда?</w:t>
+        <w:t>Права доступа через API — где они хранятся и администрируются: внутри платформы, или платформа лишь получает их из внешней системы и применяет? Если второе — какая система источник и как часто обновляется?</w:t>
       </w:r>
     </w:p>
     <w:p>
       <w:pPr>
         <w:pStyle w:val="ListNumber"/>
-        <w:spacing w:after="200"/>
+        <w:spacing w:after="160"/>
       </w:pPr>
       <w:r>
-        <w:t>Формальный критерий перехода в проект: пилот не прошёл все пороги приёмки (Сценарий 6: 67,4%/70%, Сценарий 4: 87,5%/95%) — Д8 согласен двигаться дальше при текущем результате, или ждём отдельного дозакрытия этих двух пунктов до старта П1?</w:t>
+        <w:t>Кастомизация выбора источников — что имеется в виду: (а) подключение/отключение целых каталогов данных внутри домена, или (б) выбор персоны/профиля с отдельным набором прав? Разный объём реализации.</w:t>
+      </w:r>
+    </w:p>
+    <w:p>
+      <w:pPr>
+        <w:pStyle w:val="ListNumber"/>
+        <w:spacing w:after="160"/>
+      </w:pPr>
+      <w:r>
+        <w:t>Персональные RAG-коллекции — механика: фильтр по документам внутри существующей коллекции, или отдельная новая коллекция, которую пользователь создаёт и наполняет сам?</w:t>
+      </w:r>
+    </w:p>
+    <w:p>
+      <w:pPr>
+        <w:pStyle w:val="ListNumber"/>
+        <w:spacing w:after="160"/>
+      </w:pPr>
+      <w:r>
+        <w:t>Упрощение заведения пользователей — нужен конкретный кейс: как должен выглядеть процесс пошагово (кто инициирует, какие поля, кто подтверждает).</w:t>
       </w:r>
     </w:p>
     <w:sectPr>

</xml_diff>

<commit_message>
Add 4 more questions to D8 questions doc: role model, target scenarios, training headcount, test env readiness
Co-Authored-By: Claude Sonnet 5 <noreply@anthropic.com>
Claude-Session: https://claude.ai/code/session_01DpSN8JwCJ3tg3JVUadr2zE
</commit_message>
<xml_diff>
--- a/docs/presentations/case-27-voprosy-k-zakazchiku.docx
+++ b/docs/presentations/case-27-voprosy-k-zakazchiku.docx
@@ -226,6 +226,53 @@
       </w:pPr>
       <w:r>
         <w:t>Упрощение заведения пользователей — нужен конкретный кейс: как должен выглядеть процесс пошагово (кто инициирует, какие поля, кто подтверждает).</w:t>
+      </w:r>
+    </w:p>
+    <w:p>
+      <w:pPr>
+        <w:pStyle w:val="Heading2"/>
+      </w:pPr>
+      <w:r>
+        <w:rPr>
+          <w:sz w:val="26"/>
+        </w:rPr>
+        <w:t>Дополнительные вопросы</w:t>
+      </w:r>
+    </w:p>
+    <w:p>
+      <w:pPr>
+        <w:pStyle w:val="ListNumber"/>
+        <w:spacing w:after="160"/>
+      </w:pPr>
+      <w:r>
+        <w:t>Ролевая модель — просим явно зафиксировать желаемую ролевую модель: список ролей и набор прав/доступов для каждой роли в проекте.</w:t>
+      </w:r>
+    </w:p>
+    <w:p>
+      <w:pPr>
+        <w:pStyle w:val="ListNumber"/>
+        <w:spacing w:after="160"/>
+      </w:pPr>
+      <w:r>
+        <w:t>Кейсы и сценарии — есть ли конкретные кейсы и сценарии использования, которые вы хотите увидеть реализованными в рамках внедрения?</w:t>
+      </w:r>
+    </w:p>
+    <w:p>
+      <w:pPr>
+        <w:pStyle w:val="ListNumber"/>
+        <w:spacing w:after="160"/>
+      </w:pPr>
+      <w:r>
+        <w:t>Пользователи на обучение — сколько пользователей (именно технологов/специалистов, работающих с системой) вы планируете выделить на обучение и дальнейшую работу с системой?</w:t>
+      </w:r>
+    </w:p>
+    <w:p>
+      <w:pPr>
+        <w:pStyle w:val="ListNumber"/>
+        <w:spacing w:after="160"/>
+      </w:pPr>
+      <w:r>
+        <w:t>Тестовая среда — какие сроки готовности тестовой среды со стороны Д8?</w:t>
       </w:r>
     </w:p>
     <w:sectPr>

</xml_diff>